<commit_message>
v.1.26.6.70 BK #594875, #582359, #567340, #updateReady
</commit_message>
<xml_diff>
--- a/Layouts/SalesReceivables/StandardStatementZX.docx
+++ b/Layouts/SalesReceivables/StandardStatementZX.docx
@@ -6460,6 +6460,8 @@
  
              < R e p o r t N a m e > R e p o r t   N a m e < / R e p o r t N a m e >   
+             < R e p o r t C a p t i o n > R e p o r t   C a p t i o n < / R e p o r t C a p t i o n > + 
              < A b o u t T h i s R e p o r t T i t l e > A b o u t   T h i s   R e p o r t   T i t l e < / A b o u t T h i s R e p o r t T i t l e >   
              < A b o u t T h i s R e p o r t T e x t > A b o u t   T h i s   R e p o r t   T e x t < / A b o u t T h i s R e p o r t T e x t > @@ -6505,6 +6507,84 @@
              < / D a t e T i m e V a l u e s >   
          < / R e p o r t R e q u e s t > + 
+         < C o m p a n y M e t a d a t a > + 
+             < C o m p a n y N a m e > C o m p a n y   N a m e < / C o m p a n y N a m e > + 
+             < C o m p a n y D i s p l a y N a m e > C o m p a n y   D i s p l a y   N a m e < / C o m p a n y D i s p l a y N a m e > + 
+             < C o m p a n y A d d r e s s L i n e s > + 
+                 < C o m p a n y A d d r e s s L i n e 1 > C o m p a n y   A d d r e s s   L i n e   1 < / C o m p a n y A d d r e s s L i n e 1 > + 
+                 < C o m p a n y A d d r e s s L i n e 2 > C o m p a n y   A d d r e s s   L i n e   2 < / C o m p a n y A d d r e s s L i n e 2 > + 
+                 < C o m p a n y A d d r e s s L i n e 3 > C o m p a n y   A d d r e s s   L i n e   3 < / C o m p a n y A d d r e s s L i n e 3 > + 
+                 < C o m p a n y A d d r e s s L i n e 4 > C o m p a n y   A d d r e s s   L i n e   4 < / C o m p a n y A d d r e s s L i n e 4 > + 
+                 < C o m p a n y A d d r e s s L i n e 5 > C o m p a n y   A d d r e s s   L i n e   5 < / C o m p a n y A d d r e s s L i n e 5 > + 
+                 < C o m p a n y A d d r e s s L i n e 6 > C o m p a n y   A d d r e s s   L i n e   6 < / C o m p a n y A d d r e s s L i n e 6 > + 
+                 < C o m p a n y A d d r e s s L i n e 7 > C o m p a n y   A d d r e s s   L i n e   7 < / C o m p a n y A d d r e s s L i n e 7 > + 
+                 < C o m p a n y A d d r e s s L i n e 8 > C o m p a n y   A d d r e s s   L i n e   8 < / C o m p a n y A d d r e s s L i n e 8 > + 
+             < / C o m p a n y A d d r e s s L i n e s > + 
+             < C o m p a n y P h o n e > C o m p a n y   P h o n e < / C o m p a n y P h o n e > + 
+             < C o m p a n y P h o n e C a p t i o n > C o m p a n y   P h o n e   C a p t i o n < / C o m p a n y P h o n e C a p t i o n > + 
+             < C o m p a n y F a x N o > C o m p a n y   F a x   N o . < / C o m p a n y F a x N o > + 
+             < C o m p a n y F a x N o C a p t i o n > C o m p a n y   F a x   N o .   C a p t i o n < / C o m p a n y F a x N o C a p t i o n > + 
+             < C o m p a n y E m a i l > C o m p a n y   E m a i l < / C o m p a n y E m a i l > + 
+             < C o m p a n y E m a i l C a p t i o n > C o m p a n y   E m a i l   C a p t i o n < / C o m p a n y E m a i l C a p t i o n > + 
+             < C o m p a n y H o m e P a g e > C o m p a n y   H o m e   P a g e < / C o m p a n y H o m e P a g e > + 
+             < C o m p a n y H o m e P a g e C a p t i o n > C o m p a n y   H o m e   P a g e   C a p t i o n < / C o m p a n y H o m e P a g e C a p t i o n > + 
+             < C o m p a n y L o g o > C o m p a n y   L o g o < / C o m p a n y L o g o > + 
+             < C o m p a n y V A T R e g i s t r a t i o n N o > C o m p a n y   V A T   R e g i s t r a t i o n   N o . < / C o m p a n y V A T R e g i s t r a t i o n N o > + 
+             < C o m p a n y V A T R e g i s t r a t i o n N o C a p t i o n > C o m p a n y   V A T   R e g i s t r a t i o n   N o .   C a p t i o n < / C o m p a n y V A T R e g i s t r a t i o n N o C a p t i o n > + 
+             < C o m p a n y R e g i s t r a t i o n N o > C o m p a n y   R e g i s t r a t i o n   N o . < / C o m p a n y R e g i s t r a t i o n N o > + 
+             < C o m p a n y R e g i s t r a t i o n N o C a p t i o n > C o m p a n y   R e g i s t r a t i o n   N o .   C a p t i o n < / C o m p a n y R e g i s t r a t i o n N o C a p t i o n > + 
+             < C o m p a n y B a n k N a m e > C o m p a n y   B a n k   N a m e < / C o m p a n y B a n k N a m e > + 
+             < C o m p a n y B a n k N a m e C a p t i o n > C o m p a n y   B a n k   N a m e   C a p t i o n < / C o m p a n y B a n k N a m e C a p t i o n > + 
+             < C o m p a n y B a n k A c c o u n t N o > C o m p a n y   B a n k   A c c o u n t   N o . < / C o m p a n y B a n k A c c o u n t N o > + 
+             < C o m p a n y B a n k A c c o u n t N o C a p t i o n > C o m p a n y   B a n k   A c c o u n t   N o .   C a p t i o n < / C o m p a n y B a n k A c c o u n t N o C a p t i o n > + 
+             < C o m p a n y B a n k B r a n c h N o > C o m p a n y   B a n k   B r a n c h   N o . < / C o m p a n y B a n k B r a n c h N o > + 
+             < C o m p a n y B a n k B r a n c h N o C a p t i o n > C o m p a n y   B a n k   B r a n c h   N o .   C a p t i o n < / C o m p a n y B a n k B r a n c h N o C a p t i o n > + 
+             < C o m p a n y I B A N > C o m p a n y   I B A N < / C o m p a n y I B A N > + 
+             < C o m p a n y I B A N C a p t i o n > C o m p a n y   I B A N   C a p t i o n < / C o m p a n y I B A N C a p t i o n > + 
+             < C o m p a n y B a n k S W I F T > C o m p a n y   B a n k   S W I F T < / C o m p a n y B a n k S W I F T > + 
+             < C o m p a n y B a n k S W I F T C a p t i o n > C o m p a n y   B a n k   S W I F T   C a p t i o n < / C o m p a n y B a n k S W I F T C a p t i o n > + 
+             < C o m p a n y G i r o N o > C o m p a n y   G i r o   N o . < / C o m p a n y G i r o N o > + 
+             < C o m p a n y G i r o N o C a p t i o n > C o m p a n y   G i r o   N o .   C a p t i o n < / C o m p a n y G i r o N o C a p t i o n > + 
+         < / C o m p a n y M e t a d a t a >   
      < / B C R e p o r t I n f o r m a t i o n >   
@@ -6809,6 +6889,529 @@
 
 <file path=customXml/item2.xml><?xml version="1.0" encoding="utf-8"?>
 <b:Sources xmlns:b="http://schemas.openxmlformats.org/officeDocument/2006/bibliography" xmlns="http://schemas.openxmlformats.org/officeDocument/2006/bibliography" SelectedStyle="\apasixtheditionofficeonline.xsl" StyleName="APA" Version="6"/>
+</file>
+
+<file path=customXml/item4.xml>��< ? x m l   v e r s i o n = " 1 . 0 "   e n c o d i n g = " u t f - 1 6 " ? > + 
+ < N a v W o r d R e p o r t X m l P a r t   x m l n s = " u r n : m i c r o s o f t - d y n a m i c s - b u s i n e s s c e n t r a l / i n t e r n a l / e x t e n d e d / r e p o r t s / S t a n d a r d _ S t a t e m e n t _ Z y x e l / 5 0 0 6 2 / " > + 
+     < B C R e p o r t I n f o r m a t i o n > + 
+         < R e p o r t M e t a d a t a > + 
+             < E x t e n s i o n I d > E x t e n s i o n   I D < / E x t e n s i o n I d > + 
+             < E x t e n s i o n N a m e > E x t e n s i o n   N a m e < / E x t e n s i o n N a m e > + 
+             < E x t e n s i o n P u b l i s h e r > E x t e n s i o n   P u b l i s h e r < / E x t e n s i o n P u b l i s h e r > + 
+             < E x t e n s i o n V e r s i o n > E x t e n s i o n   V e r s i o n < / E x t e n s i o n V e r s i o n > + 
+             < R e p o r t I d > R e p o r t   I D < / R e p o r t I d > + 
+             < R e p o r t N a m e > R e p o r t   N a m e < / R e p o r t N a m e > + 
+             < R e p o r t C a p t i o n > R e p o r t   C a p t i o n < / R e p o r t C a p t i o n > + 
+             < A b o u t T h i s R e p o r t T i t l e > A b o u t   T h i s   R e p o r t   T i t l e < / A b o u t T h i s R e p o r t T i t l e > + 
+             < A b o u t T h i s R e p o r t T e x t > A b o u t   T h i s   R e p o r t   T e x t < / A b o u t T h i s R e p o r t T e x t > + 
+             < R e p o r t H e l p L i n k > R e p o r t   H e l p   L i n k < / R e p o r t H e l p L i n k > + 
+         < / R e p o r t M e t a d a t a > + 
+         < R e p o r t R e q u e s t > + 
+             < T e n a n t E n t r a I d > T e n a n t   E n t r a   I d < / T e n a n t E n t r a I d > + 
+             < E n v i r o n m e n t N a m e > E n v i r o n m e n t   N a m e < / E n v i r o n m e n t N a m e > + 
+             < E n v i r o n m e n t T y p e > E n v i r o n m e n t   T y p e < / E n v i r o n m e n t T y p e > + 
+             < C o m p a n y N a m e > C o m p a n y   N a m e < / C o m p a n y N a m e > + 
+             < C o m p a n y D i s p l a y N a m e > C o m p a n y   D i s p l a y   N a m e < / C o m p a n y D i s p l a y N a m e > + 
+             < C o m p a n y I d > C o m p a n y   I D < / C o m p a n y I d > + 
+             < U s e r N a m e > U s e r   N a m e < / U s e r N a m e > + 
+             < D a t e A n d T i m e > D a t e   a n d   T i m e < / D a t e A n d T i m e > + 
+             < L a n g u a g e > L a n g u a g e < / L a n g u a g e > + 
+             < F o r m a t R e g i o n > F o r m a t   R e g i o n < / F o r m a t R e g i o n > + 
+             < D a t e T i m e V a l u e s > + 
+                 < Y e a r > Y e a r < / Y e a r > + 
+                 < M o n t h N u m b e r > M o n t h   N u m b e r < / M o n t h N u m b e r > + 
+                 < D a y N u m b e r > D a y   N u m b e r < / D a y N u m b e r > + 
+                 < H o u r > H o u r < / H o u r > + 
+                 < M i n u t e > M i n u t e < / M i n u t e > + 
+             < / D a t e T i m e V a l u e s > + 
+         < / R e p o r t R e q u e s t > + 
+         < C o m p a n y M e t a d a t a > + 
+             < C o m p a n y N a m e > C o m p a n y   N a m e < / C o m p a n y N a m e > + 
+             < C o m p a n y D i s p l a y N a m e > C o m p a n y   D i s p l a y   N a m e < / C o m p a n y D i s p l a y N a m e > + 
+             < C o m p a n y A d d r e s s L i n e s > + 
+                 < C o m p a n y A d d r e s s L i n e 1 > C o m p a n y   A d d r e s s   L i n e   1 < / C o m p a n y A d d r e s s L i n e 1 > + 
+                 < C o m p a n y A d d r e s s L i n e 2 > C o m p a n y   A d d r e s s   L i n e   2 < / C o m p a n y A d d r e s s L i n e 2 > + 
+                 < C o m p a n y A d d r e s s L i n e 3 > C o m p a n y   A d d r e s s   L i n e   3 < / C o m p a n y A d d r e s s L i n e 3 > + 
+                 < C o m p a n y A d d r e s s L i n e 4 > C o m p a n y   A d d r e s s   L i n e   4 < / C o m p a n y A d d r e s s L i n e 4 > + 
+                 < C o m p a n y A d d r e s s L i n e 5 > C o m p a n y   A d d r e s s   L i n e   5 < / C o m p a n y A d d r e s s L i n e 5 > + 
+                 < C o m p a n y A d d r e s s L i n e 6 > C o m p a n y   A d d r e s s   L i n e   6 < / C o m p a n y A d d r e s s L i n e 6 > + 
+                 < C o m p a n y A d d r e s s L i n e 7 > C o m p a n y   A d d r e s s   L i n e   7 < / C o m p a n y A d d r e s s L i n e 7 > + 
+                 < C o m p a n y A d d r e s s L i n e 8 > C o m p a n y   A d d r e s s   L i n e   8 < / C o m p a n y A d d r e s s L i n e 8 > + 
+             < / C o m p a n y A d d r e s s L i n e s > + 
+             < C o m p a n y P h o n e > C o m p a n y   P h o n e < / C o m p a n y P h o n e > + 
+             < C o m p a n y P h o n e C a p t i o n > C o m p a n y   P h o n e   C a p t i o n < / C o m p a n y P h o n e C a p t i o n > + 
+             < C o m p a n y F a x N o > C o m p a n y   F a x   N o . < / C o m p a n y F a x N o > + 
+             < C o m p a n y F a x N o C a p t i o n > C o m p a n y   F a x   N o .   C a p t i o n < / C o m p a n y F a x N o C a p t i o n > + 
+             < C o m p a n y E m a i l > C o m p a n y   E m a i l < / C o m p a n y E m a i l > + 
+             < C o m p a n y E m a i l C a p t i o n > C o m p a n y   E m a i l   C a p t i o n < / C o m p a n y E m a i l C a p t i o n > + 
+             < C o m p a n y H o m e P a g e > C o m p a n y   H o m e   P a g e < / C o m p a n y H o m e P a g e > + 
+             < C o m p a n y H o m e P a g e C a p t i o n > C o m p a n y   H o m e   P a g e   C a p t i o n < / C o m p a n y H o m e P a g e C a p t i o n > + 
+             < C o m p a n y L o g o > C o m p a n y   L o g o < / C o m p a n y L o g o > + 
+             < C o m p a n y V A T R e g i s t r a t i o n N o > C o m p a n y   V A T   R e g i s t r a t i o n   N o . < / C o m p a n y V A T R e g i s t r a t i o n N o > + 
+             < C o m p a n y V A T R e g i s t r a t i o n N o C a p t i o n > C o m p a n y   V A T   R e g i s t r a t i o n   N o .   C a p t i o n < / C o m p a n y V A T R e g i s t r a t i o n N o C a p t i o n > + 
+             < C o m p a n y R e g i s t r a t i o n N o > C o m p a n y   R e g i s t r a t i o n   N o . < / C o m p a n y R e g i s t r a t i o n N o > + 
+             < C o m p a n y R e g i s t r a t i o n N o C a p t i o n > C o m p a n y   R e g i s t r a t i o n   N o .   C a p t i o n < / C o m p a n y R e g i s t r a t i o n N o C a p t i o n > + 
+             < C o m p a n y B a n k N a m e > C o m p a n y   B a n k   N a m e < / C o m p a n y B a n k N a m e > + 
+             < C o m p a n y B a n k N a m e C a p t i o n > C o m p a n y   B a n k   N a m e   C a p t i o n < / C o m p a n y B a n k N a m e C a p t i o n > + 
+             < C o m p a n y B a n k A c c o u n t N o > C o m p a n y   B a n k   A c c o u n t   N o . < / C o m p a n y B a n k A c c o u n t N o > + 
+             < C o m p a n y B a n k A c c o u n t N o C a p t i o n > C o m p a n y   B a n k   A c c o u n t   N o .   C a p t i o n < / C o m p a n y B a n k A c c o u n t N o C a p t i o n > + 
+             < C o m p a n y B a n k B r a n c h N o > C o m p a n y   B a n k   B r a n c h   N o . < / C o m p a n y B a n k B r a n c h N o > + 
+             < C o m p a n y B a n k B r a n c h N o C a p t i o n > C o m p a n y   B a n k   B r a n c h   N o .   C a p t i o n < / C o m p a n y B a n k B r a n c h N o C a p t i o n > + 
+             < C o m p a n y I B A N > C o m p a n y   I B A N < / C o m p a n y I B A N > + 
+             < C o m p a n y I B A N C a p t i o n > C o m p a n y   I B A N   C a p t i o n < / C o m p a n y I B A N C a p t i o n > + 
+             < C o m p a n y B a n k S W I F T > C o m p a n y   B a n k   S W I F T < / C o m p a n y B a n k S W I F T > + 
+             < C o m p a n y B a n k S W I F T C a p t i o n > C o m p a n y   B a n k   S W I F T   C a p t i o n < / C o m p a n y B a n k S W I F T C a p t i o n > + 
+             < C o m p a n y G i r o N o > C o m p a n y   G i r o   N o . < / C o m p a n y G i r o N o > + 
+             < C o m p a n y G i r o N o C a p t i o n > C o m p a n y   G i r o   N o .   C a p t i o n < / C o m p a n y G i r o N o C a p t i o n > + 
+         < / C o m p a n y M e t a d a t a > + 
+     < / B C R e p o r t I n f o r m a t i o n > + 
+     < T o o l t i p s > + 
+         < T o o l t i p   c o l u m n = " N o _ C u s t "   E l e m e n t I d = " 6 0 3 9 7 0 8 4 6 " > + 
+             < T o o l t i p T e x t   l a n g = " e n - U S " > S p e c i f i e s   t h e   n u m b e r   o f   t h e   c u s t o m e r .   T h e   f i e l d   i s   e i t h e r   f i l l e d   a u t o m a t i c a l l y   f r o m   a   d e f i n e d   n u m b e r   s e r i e s ,   o r   y o u   e n t e r   t h e   n u m b e r   m a n u a l l y   b e c a u s e   y o u   h a v e   e n a b l e d   m a n u a l   n u m b e r   e n t r y   i n   t h e   n u m b e r - s e r i e s   s e t u p . < / T o o l t i p T e x t > + 
+         < / T o o l t i p > + 
+         < T o o l t i p   c o l u m n = " N o 1 _ C u s t "   E l e m e n t I d = " 9 1 2 7 7 0 5 0 9 " > + 
+             < T o o l t i p T e x t   l a n g = " e n - U S " > S p e c i f i e s   t h e   n u m b e r   o f   t h e   c u s t o m e r .   T h e   f i e l d   i s   e i t h e r   f i l l e d   a u t o m a t i c a l l y   f r o m   a   d e f i n e d   n u m b e r   s e r i e s ,   o r   y o u   e n t e r   t h e   n u m b e r   m a n u a l l y   b e c a u s e   y o u   h a v e   e n a b l e d   m a n u a l   n u m b e r   e n t r y   i n   t h e   n u m b e r - s e r i e s   s e t u p . < / T o o l t i p T e x t > + 
+         < / T o o l t i p > + 
+         < T o o l t i p   c o l u m n = " D o c N o _ D t l d C u s t L e d g E n t r i e s "   E l e m e n t I d = " 2 2 4 2 9 8 6 5 4 " > + 
+             < T o o l t i p T e x t   l a n g = " e n - U S " > S p e c i f i e s   t h e   d o c u m e n t   n u m b e r   o f   t h e   t r a n s a c t i o n   t h a t   c r e a t e d   t h e   e n t r y . < / T o o l t i p T e x t > + 
+         < / T o o l t i p > + 
+         < T o o l t i p   c o l u m n = " C u r r C o d e _ D t l d C u s t L e d g E n t r i e s "   E l e m e n t I d = " 3 2 7 0 9 9 9 8 4 " > + 
+             < T o o l t i p T e x t   l a n g = " e n - U S " > S p e c i f i e s   t h e   c o d e   f o r   t h e   c u r r e n c y   i f   t h e   a m o u n t   i s   i n   a   f o r e i g n   c u r r e n c y . < / T o o l t i p T e x t > + 
+         < / T o o l t i p > + 
+         < T o o l t i p   c o l u m n = " A m t _ D t l d C u s t L e d g E n t r i e s "   E l e m e n t I d = " 8 9 7 9 8 5 1 7 9 " > + 
+             < T o o l t i p T e x t   l a n g = " e n - U S " > S p e c i f i e s   t h e   a m o u n t   o f   t h e   d e t a i l e d   c u s t o m e r   l e d g e r   e n t r y . < / T o o l t i p T e x t > + 
+         < / T o o l t i p > + 
+         < T o o l t i p   c o l u m n = " R e m a i n A m t _ C u s t L e d g E n t r y 2 "   E l e m e n t I d = " 7 5 6 3 4 5 4 1 3 " > + 
+             < T o o l t i p T e x t   l a n g = " e n - U S " > S p e c i f i e s   t h e   a m o u n t   t h a t   r e m a i n s   t o   b e   a p p l i e d   t o   b e f o r e   t h e   e n t r y   h a s   b e e n   c o m p l e t e l y   a p p l i e d . < / T o o l t i p T e x t > + 
+         < / T o o l t i p > + 
+         < T o o l t i p   c o l u m n = " D o c N o _ C u s t L e d g E n t r y 2 "   E l e m e n t I d = " 5 1 0 9 1 4 9 4 " > + 
+             < T o o l t i p T e x t   l a n g = " e n - U S " > S p e c i f i e s   t h e   e n t r y ' s   d o c u m e n t   n u m b e r . < / T o o l t i p T e x t > + 
+         < / T o o l t i p > + 
+         < T o o l t i p   c o l u m n = " D e s c _ C u s t L e d g E n t r y 2 "   E l e m e n t I d = " 4 0 4 4 4 3 7 9 8 " > + 
+             < T o o l t i p T e x t   l a n g = " e n - U S " > S p e c i f i e s   a   d e s c r i p t i o n   o f   t h e   c u s t o m e r   e n t r y . < / T o o l t i p T e x t > + 
+         < / T o o l t i p > + 
+         < T o o l t i p   c o l u m n = " Y o u r R e f e r e n c e _ C u s t L e d g E n t r y 2 "   E l e m e n t I d = " 2 0 5 5 4 0 4 3 9 5 " > + 
+             < T o o l t i p T e x t   l a n g = " e n - U S " > S p e c i f i e s   t h e   c u s t o m e r ' s   r e f e r e n c e . < / T o o l t i p T e x t > + 
+         < / T o o l t i p > + 
+         < T o o l t i p   c o l u m n = " O r i g i n a l A m t _ C u s t L e d g E n t r y 2 "   E l e m e n t I d = " 6 5 4 0 4 5 0 9 8 " > + 
+             < T o o l t i p T e x t   l a n g = " e n - U S " > S p e c i f i e s   t h e   a m o u n t   o f   t h e   o r i g i n a l   e n t r y . < / T o o l t i p T e x t > + 
+         < / T o o l t i p > + 
+         < T o o l t i p   c o l u m n = " C u r r C o d e _ C u s t L e d g E n t r y 2 "   E l e m e n t I d = " 1 5 8 9 5 4 6 2 6 8 " > + 
+             < T o o l t i p T e x t   l a n g = " e n - U S " > S p e c i f i e s   t h e   c u r r e n c y   c o d e   f o r   t h e   a m o u n t   o n   t h e   l i n e . < / T o o l t i p T e x t > + 
+         < / T o o l t i p > + 
+         < T o o l t i p   c o l u m n = " C u s t N o _ C u s t L e d g E n t r y 2 "   E l e m e n t I d = " 1 3 5 3 0 8 9 7 4 5 " > + 
+             < T o o l t i p T e x t   l a n g = " e n - U S " > S p e c i f i e s   t h e   c u s t o m e r   a c c o u n t   n u m b e r   t h a t   t h e   e n t r y   i s   l i n k e d   t o . < / T o o l t i p T e x t > + 
+         < / T o o l t i p > + 
+     < / T o o l t i p s > + 
+     < C u s t o m e r   E l e m e n t T y p e = " D a t a I t e m "   E l e m e n t I d = " 1 5 2 5 1 9 1 9 9 " > + 
+         < N o _ C u s t   E l e m e n t T y p e = " C o l u m n "   E l e m e n t I d = " 6 0 3 9 7 0 8 4 6 "   D a t a T y p e = " C o d e " > N o _ C u s t < / N o _ C u s t > + 
+         < I n t e g e r   E l e m e n t T y p e = " D a t a I t e m "   E l e m e n t I d = " 1 7 3 5 6 9 8 6 1 9 " > + 
+             < B a n k A c c N o _ C o m p a n y I n f o   E l e m e n t T y p e = " C o l u m n "   E l e m e n t I d = " 8 6 4 5 4 5 9 0 7 "   D a t a T y p e = " T e x t " > B a n k A c c N o _ C o m p a n y I n f o < / B a n k A c c N o _ C o m p a n y I n f o > + 
+             < B a n k A c c N o _ C o m p a n y I n f o C a p t i o n   E l e m e n t T y p e = " C o l u m n "   E l e m e n t I d = " 1 9 1 8 8 5 3 8 1 3 "   D a t a T y p e = " L a b e l " > B a n k A c c N o _ C o m p a n y I n f o C a p t i o n < / B a n k A c c N o _ C o m p a n y I n f o C a p t i o n > + 
+             < B a n k N a m e _ C o m p a n y I n f o   E l e m e n t T y p e = " C o l u m n "   E l e m e n t I d = " 1 9 1 7 2 0 2 0 4 2 "   D a t a T y p e = " T e x t " > B a n k N a m e _ C o m p a n y I n f o < / B a n k N a m e _ C o m p a n y I n f o > + 
+             < B a n k N a m e _ C o m p a n y I n f o C a p t i o n   E l e m e n t T y p e = " C o l u m n "   E l e m e n t I d = " 1 6 0 4 3 0 7 5 8 8 "   D a t a T y p e = " L a b e l " > B a n k N a m e _ C o m p a n y I n f o C a p t i o n < / B a n k N a m e _ C o m p a n y I n f o C a p t i o n > + 
+             < C o m p a n y A d d r 1   E l e m e n t T y p e = " C o l u m n "   E l e m e n t I d = " 8 8 5 0 9 6 1 0 4 "   D a t a T y p e = " T e x t " > C o m p a n y A d d r 1 < / C o m p a n y A d d r 1 > + 
+             < C o m p a n y A d d r 2   E l e m e n t T y p e = " C o l u m n "   E l e m e n t I d = " 1 0 2 7 9 9 3 7 4 7 "   D a t a T y p e = " T e x t " > C o m p a n y A d d r 2 < / C o m p a n y A d d r 2 > + 
+             < C o m p a n y A d d r 3   E l e m e n t T y p e = " C o l u m n "   E l e m e n t I d = " 3 9 0 2 9 7 1 3 0 "   D a t a T y p e = " T e x t " > C o m p a n y A d d r 3 < / C o m p a n y A d d r 3 > + 
+             < C o m p a n y A d d r 4   E l e m e n t T y p e = " C o l u m n "   E l e m e n t I d = " 1 9 9 1 5 8 0 3 1 5 "   D a t a T y p e = " T e x t " > C o m p a n y A d d r 4 < / C o m p a n y A d d r 4 > + 
+             < C o m p a n y A d d r 5   E l e m e n t T y p e = " C o l u m n "   E l e m e n t I d = " 1 6 6 5 6 9 0 3 6 4 "   D a t a T y p e = " T e x t " > C o m p a n y A d d r 5 < / C o m p a n y A d d r 5 > + 
+             < C o m p a n y A d d r 6   E l e m e n t T y p e = " C o l u m n "   E l e m e n t I d = " 7 1 6 1 8 7 0 8 1 "   D a t a T y p e = " T e x t " > C o m p a n y A d d r 6 < / C o m p a n y A d d r 6 > + 
+             < C o m p a n y A d d r 7   E l e m e n t T y p e = " C o l u m n "   E l e m e n t I d = " 1 3 5 3 8 8 3 6 9 8 "   D a t a T y p e = " T e x t " > C o m p a n y A d d r 7 < / C o m p a n y A d d r 7 > + 
+             < C o m p a n y A d d r 8   E l e m e n t T y p e = " C o l u m n "   E l e m e n t I d = " 1 0 5 4 0 0 5 1 2 7 "   D a t a T y p e = " T e x t " > C o m p a n y A d d r 8 < / C o m p a n y A d d r 8 > + 
+             < C o m p a n y I n f o 1 P i c t u r e   E l e m e n t T y p e = " C o l u m n "   E l e m e n t I d = " 1 0 1 8 2 0 6 5 0 3 "   D a t a T y p e = " B l o b "   / > + 
+             < C o m p a n y I n f o 2 P i c t u r e   E l e m e n t T y p e = " C o l u m n "   E l e m e n t I d = " 9 8 9 6 7 0 4 7 4 "   D a t a T y p e = " B l o b "   / > + 
+             < C o m p a n y I n f o 3 P i c t u r e   E l e m e n t T y p e = " C o l u m n "   E l e m e n t I d = " 5 7 9 7 0 4 0 5 9 "   D a t a T y p e = " B l o b "   / > + 
+             < C o m p a n y I n f o E m a i l   E l e m e n t T y p e = " C o l u m n "   E l e m e n t I d = " 9 1 4 8 1 2 2 4 0 "   D a t a T y p e = " T e x t " > C o m p a n y I n f o E m a i l < / C o m p a n y I n f o E m a i l > + 
+             < C o m p a n y I n f o E m a i l C a p t i o n   E l e m e n t T y p e = " C o l u m n "   E l e m e n t I d = " 1 5 5 2 1 6 7 2 3 0 "   D a t a T y p e = " L a b e l " > C o m p a n y I n f o E m a i l C a p t i o n < / C o m p a n y I n f o E m a i l C a p t i o n > + 
+             < C o m p a n y I n f o H o m e P a g e   E l e m e n t T y p e = " C o l u m n "   E l e m e n t I d = " 1 5 3 0 3 1 7 4 4 0 "   D a t a T y p e = " T e x t " > C o m p a n y I n f o H o m e P a g e < / C o m p a n y I n f o H o m e P a g e > + 
+             < C o m p a n y I n f o H o m e p a g e C a p t i o n   E l e m e n t T y p e = " C o l u m n "   E l e m e n t I d = " 1 5 2 9 8 2 3 8 6 "   D a t a T y p e = " L a b e l " > C o m p a n y I n f o H o m e p a g e C a p t i o n < / C o m p a n y I n f o H o m e p a g e C a p t i o n > + 
+             < C o m p a n y L e g a l O f f i c e   E l e m e n t T y p e = " C o l u m n "   E l e m e n t I d = " 7 1 4 2 5 8 1 1 1 "   D a t a T y p e = " S t r i n g " > C o m p a n y L e g a l O f f i c e < / C o m p a n y L e g a l O f f i c e > + 
+             < C o m p a n y L e g a l O f f i c e _ L b l   E l e m e n t T y p e = " C o l u m n "   E l e m e n t I d = " 1 5 3 3 1 7 5 1 0 8 "   D a t a T y p e = " S t r i n g " > C o m p a n y L e g a l O f f i c e _ L b l < / C o m p a n y L e g a l O f f i c e _ L b l > + 
+             < C o m p a n y P i c t u r e   E l e m e n t T y p e = " C o l u m n "   E l e m e n t I d = " 1 3 9 7 4 1 1 0 7 4 "   D a t a T y p e = " B l o b "   / > + 
+             < C u r r R e p o r t P a g e N o C a p t i o n   E l e m e n t T y p e = " C o l u m n "   E l e m e n t I d = " 2 0 2 2 2 2 5 3 5 1 "   D a t a T y p e = " L a b e l " > C u r r R e p o r t P a g e N o C a p t i o n < / C u r r R e p o r t P a g e N o C a p t i o n > + 
+             < C u s t A d d r 1   E l e m e n t T y p e = " C o l u m n "   E l e m e n t I d = " 1 3 6 8 0 2 7 5 2 2 "   D a t a T y p e = " T e x t " > C u s t A d d r 1 < / C u s t A d d r 1 > + 
+             < C u s t A d d r 2   E l e m e n t T y p e = " C o l u m n "   E l e m e n t I d = " 2 0 0 5 7 2 4 1 3 9 "   D a t a T y p e = " T e x t " > C u s t A d d r 2 < / C u s t A d d r 2 > + 
+             < C u s t A d d r 3   E l e m e n t T y p e = " C o l u m n "   E l e m e n t I d = " 1 6 5 1 5 4 6 5 4 0 "   D a t a T y p e = " T e x t " > C u s t A d d r 3 < / C u s t A d d r 3 > + 
+             < C u s t A d d r 4   E l e m e n t T y p e = " C o l u m n "   E l e m e n t I d = " 1 0 1 3 8 4 9 9 2 3 "   D a t a T y p e = " T e x t " > C u s t A d d r 4 < / C u s t A d d r 4 > + 
+             < C u s t A d d r 5   E l e m e n t T y p e = " C o l u m n "   E l e m e n t I d = " 3 7 6 1 5 3 3 0 6 "   D a t a T y p e = " T e x t " > C u s t A d d r 5 < / C u s t A d d r 5 > + 
+             < C u s t A d d r 6   E l e m e n t T y p e = " C o l u m n "   E l e m e n t I d = " 2 6 1 5 4 3 3 1 1 "   D a t a T y p e = " T e x t " > C u s t A d d r 6 < / C u s t A d d r 6 > + 
+             < C u s t A d d r 7   E l e m e n t T y p e = " C o l u m n "   E l e m e n t I d = " 8 9 9 2 3 9 9 2 8 "   D a t a T y p e = " T e x t " > C u s t A d d r 7 < / C u s t A d d r 7 > + 
+             < C u s t A d d r 8   E l e m e n t T y p e = " C o l u m n "   E l e m e n t I d = " 1 5 3 6 9 3 6 5 4 5 "   D a t a T y p e = " T e x t " > C u s t A d d r 8 < / C u s t A d d r 8 > + 
+             < C u s t B a l a n c e C a p t i o n   E l e m e n t T y p e = " C o l u m n "   E l e m e n t I d = " 6 0 8 6 6 1 8 8 4 "   D a t a T y p e = " L a b e l " > C u s t B a l a n c e C a p t i o n < / C u s t B a l a n c e C a p t i o n > + 
+             < D e s c _ C u s t L e d g E n t r y 2 C a p t i o n   E l e m e n t T y p e = " C o l u m n "   E l e m e n t I d = " 1 8 7 4 4 3 7 6 7 2 "   D a t a T y p e = " S t r i n g " > D e s c _ C u s t L e d g E n t r y 2 C a p t i o n < / D e s c _ C u s t L e d g E n t r y 2 C a p t i o n > + 
+             < D o c D a t e C a p t i o n   E l e m e n t T y p e = " C o l u m n "   E l e m e n t I d = " 1 1 5 7 6 2 1 5 3 7 "   D a t a T y p e = " L a b e l " > D o c D a t e C a p t i o n < / D o c D a t e C a p t i o n > + 
+             < D o c N o _ D t l d C u s t L e d g E n t r i e s C a p t i o n   E l e m e n t T y p e = " C o l u m n "   E l e m e n t I d = " 6 0 1 5 1 5 5 5 6 "   D a t a T y p e = " S t r i n g " > D o c N o _ D t l d C u s t L e d g E n t r i e s C a p t i o n < / D o c N o _ D t l d C u s t L e d g E n t r i e s C a p t i o n > + 
+             < D u e D a t e _ C u s t L e d g E n t r y 2 C a p t i o n   E l e m e n t T y p e = " C o l u m n "   E l e m e n t I d = " 8 1 9 2 8 5 8 5 "   D a t a T y p e = " L a b e l " > D u e D a t e _ C u s t L e d g E n t r y 2 C a p t i o n < / D u e D a t e _ C u s t L e d g E n t r y 2 C a p t i o n > + 
+             < E n d D a t e   E l e m e n t T y p e = " C o l u m n "   E l e m e n t I d = " 1 3 0 2 0 8 2 6 1 0 "   D a t a T y p e = " S t r i n g " > E n d D a t e < / E n d D a t e > + 
+             < E n d D a t e C a p t i o n   E l e m e n t T y p e = " C o l u m n "   E l e m e n t I d = " 1 3 5 3 1 9 2 8 0 "   D a t a T y p e = " L a b e l " > E n d D a t e C a p t i o n < / E n d D a t e C a p t i o n > + 
+             < G i r o N o _ C o m p a n y I n f o   E l e m e n t T y p e = " C o l u m n "   E l e m e n t I d = " 5 6 5 4 8 5 5 1 9 "   D a t a T y p e = " T e x t " > G i r o N o _ C o m p a n y I n f o < / G i r o N o _ C o m p a n y I n f o > + 
+             < G i r o N o _ C o m p a n y I n f o C a p t i o n   E l e m e n t T y p e = " C o l u m n "   E l e m e n t I d = " 1 6 5 8 5 3 3 3 6 9 "   D a t a T y p e = " L a b e l " > G i r o N o _ C o m p a n y I n f o C a p t i o n < / G i r o N o _ C o m p a n y I n f o C a p t i o n > + 
+             < L a s t S t a t m n t N o _ C u s t   E l e m e n t T y p e = " C o l u m n "   E l e m e n t I d = " 1 3 8 8 0 8 0 0 2 9 "   D a t a T y p e = " S t r i n g " > L a s t S t a t m n t N o _ C u s t < / L a s t S t a t m n t N o _ C u s t > + 
+             < L a s t S t a t m n t N o _ C u s t C a p t i o n   E l e m e n t T y p e = " C o l u m n "   E l e m e n t I d = " 8 9 2 5 6 7 8 3 5 "   D a t a T y p e = " L a b e l " > L a s t S t a t m n t N o _ C u s t C a p t i o n < / L a s t S t a t m n t N o _ C u s t C a p t i o n > + 
+             < N o 1 _ C u s t   E l e m e n t T y p e = " C o l u m n "   E l e m e n t I d = " 9 1 2 7 7 0 5 0 9 "   D a t a T y p e = " C o d e " > N o 1 _ C u s t < / N o 1 _ C u s t > + 
+             < N o 1 _ C u s t C a p t i o n   E l e m e n t T y p e = " C o l u m n "   E l e m e n t I d = " 1 6 6 1 8 9 3 3 9 7 "   D a t a T y p e = " L a b e l " > N o 1 _ C u s t C a p t i o n < / N o 1 _ C u s t C a p t i o n > + 
+             < O r i g i n a l A m t _ C u s t L e d g E n t r y 2 C a p t i o n   E l e m e n t T y p e = " C o l u m n "   E l e m e n t I d = " 8 4 8 8 4 4 3 9 2 "   D a t a T y p e = " S t r i n g " > O r i g i n a l A m t _ C u s t L e d g E n t r y 2 C a p t i o n < / O r i g i n a l A m t _ C u s t L e d g E n t r y 2 C a p t i o n > + 
+             < P h o n e N o _ C o m p a n y I n f o   E l e m e n t T y p e = " C o l u m n "   E l e m e n t I d = " 1 6 0 6 4 2 8 3 9 4 "   D a t a T y p e = " T e x t " > P h o n e N o _ C o m p a n y I n f o < / P h o n e N o _ C o m p a n y I n f o > + 
+             < P h o n e N o _ C o m p a n y I n f o C a p t i o n   E l e m e n t T y p e = " C o l u m n "   E l e m e n t I d = " 1 8 7 6 0 4 7 7 0 4 "   D a t a T y p e = " L a b e l " > P h o n e N o _ C o m p a n y I n f o C a p t i o n < / P h o n e N o _ C o m p a n y I n f o C a p t i o n > + 
+             < P o s t D a t e _ D t l d C u s t L e d g E n t r i e s C a p t i o n   E l e m e n t T y p e = " C o l u m n "   E l e m e n t I d = " 1 0 3 3 1 2 5 4 2 5 "   D a t a T y p e = " L a b e l " > P o s t D a t e _ D t l d C u s t L e d g E n t r i e s C a p t i o n < / P o s t D a t e _ D t l d C u s t L e d g E n t r i e s C a p t i o n > + 
+             < R e m a i n A m t C u s t L e d g E n t r y 2 C a p t i o n   E l e m e n t T y p e = " C o l u m n "   E l e m e n t I d = " 1 6 3 2 7 0 6 4 0 6 "   D a t a T y p e = " S t r i n g " > R e m a i n A m t C u s t L e d g E n t r y 2 C a p t i o n < / R e m a i n A m t C u s t L e d g E n t r y 2 C a p t i o n > + 
+             < S t a r t D a t e   E l e m e n t T y p e = " C o l u m n "   E l e m e n t I d = " 1 4 5 7 6 6 9 4 1 7 "   D a t a T y p e = " S t r i n g " > S t a r t D a t e < / S t a r t D a t e > + 
+             < S t a r t D a t e C a p t i o n   E l e m e n t T y p e = " C o l u m n "   E l e m e n t I d = " 1 9 8 0 7 4 5 8 7 1 "   D a t a T y p e = " L a b e l " > S t a r t D a t e C a p t i o n < / S t a r t D a t e C a p t i o n > + 
+             < S t a t e m e n t C a p t i o n   E l e m e n t T y p e = " C o l u m n "   E l e m e n t I d = " 2 3 9 3 8 2 "   D a t a T y p e = " L a b e l " > S t a t e m e n t C a p t i o n < / S t a t e m e n t C a p t i o n > + 
+             < T o d a y F o r m a t t e d   E l e m e n t T y p e = " C o l u m n "   E l e m e n t I d = " 2 7 0 4 5 1 4 0 "   D a t a T y p e = " S t r i n g " > T o d a y F o r m a t t e d < / T o d a y F o r m a t t e d > + 
+             < V A T R e g N o _ C o m p a n y I n f o   E l e m e n t T y p e = " C o l u m n "   E l e m e n t I d = " 9 4 4 0 2 9 3 7 7 "   D a t a T y p e = " T e x t " > V A T R e g N o _ C o m p a n y I n f o < / V A T R e g N o _ C o m p a n y I n f o > + 
+             < V A T R e g N o _ C o m p a n y I n f o C a p t i o n   E l e m e n t T y p e = " C o l u m n "   E l e m e n t I d = " 1 1 9 3 2 7 6 3 7 5 "   D a t a T y p e = " L a b e l " > V A T R e g N o _ C o m p a n y I n f o C a p t i o n < / V A T R e g N o _ C o m p a n y I n f o C a p t i o n > + 
+             < C u r r e n c y L o o p   E l e m e n t T y p e = " D a t a I t e m "   E l e m e n t I d = " 1 3 0 4 5 2 2 1 9 8 " > + 
+                 < T o t a l _ C a p t i o n 2   E l e m e n t T y p e = " C o l u m n "   E l e m e n t I d = " 1 9 9 1 3 0 2 6 0 "   D a t a T y p e = " L a b e l " > T o t a l _ C a p t i o n 2 < / T o t a l _ C a p t i o n 2 > + 
+                 < C u s t L e d g E n t r y H d r   E l e m e n t T y p e = " D a t a I t e m "   E l e m e n t I d = " 9 4 2 7 0 7 9 3 2 " > + 
+                     < C u r r e n c y 2 C o d e _ C u s t L e d g E n t r y H d r   E l e m e n t T y p e = " C o l u m n "   E l e m e n t I d = " 1 3 4 9 2 7 9 6 1 1 "   D a t a T y p e = " S t r i n g " > C u r r e n c y 2 C o d e _ C u s t L e d g E n t r y H d r < / C u r r e n c y 2 C o d e _ C u s t L e d g E n t r y H d r > + 
+                     < C u r r e n c y C o d e 3   E l e m e n t T y p e = " C o l u m n "   E l e m e n t I d = " 6 1 8 1 4 2 9 0 8 "   D a t a T y p e = " C o d e " > C u r r e n c y C o d e 3 < / C u r r e n c y C o d e 3 > + 
+                     < C u s t B a l a n c e _ C u s t L e d g E n t r y H d r   E l e m e n t T y p e = " C o l u m n "   E l e m e n t I d = " 4 9 7 1 9 1 3 5 6 "   D a t a T y p e = " D e c i m a l " > C u s t B a l a n c e _ C u s t L e d g E n t r y H d r < / C u s t B a l a n c e _ C u s t L e d g E n t r y H d r > + 
+                     < D t l d C u s t L e d g E n t r y T y p e   E l e m e n t T y p e = " C o l u m n "   E l e m e n t I d = " 8 9 2 0 6 7 4 8 6 "   D a t a T y p e = " S t r i n g " > D t l d C u s t L e d g E n t r y T y p e < / D t l d C u s t L e d g E n t r y T y p e > + 
+                     < E n t r i e s E x i s t s   E l e m e n t T y p e = " C o l u m n "   E l e m e n t I d = " 1 8 9 9 2 2 0 4 1 "   D a t a T y p e = " B o o l e a n " > E n t r i e s E x i s t s < / E n t r i e s E x i s t s > + 
+                     < I s N e w C u s t C u r r e n c y G r o u p   E l e m e n t T y p e = " C o l u m n "   E l e m e n t I d = " 1 1 6 2 5 3 5 5 3 8 "   D a t a T y p e = " B o o l e a n " > I s N e w C u s t C u r r e n c y G r o u p < / I s N e w C u s t C u r r e n c y G r o u p > + 
+                     < P r i n t L i n e   E l e m e n t T y p e = " C o l u m n "   E l e m e n t I d = " 5 9 8 4 7 9 9 9 0 "   D a t a T y p e = " B o o l e a n " > P r i n t L i n e < / P r i n t L i n e > + 
+                     < S t a r t B a l a n c e   E l e m e n t T y p e = " C o l u m n "   E l e m e n t I d = " 3 2 9 4 8 3 5 7 9 "   D a t a T y p e = " D e c i m a l " > S t a r t B a l a n c e < / S t a r t B a l a n c e > + 
+                     < D t l d C u s t L e d g E n t r i e s   E l e m e n t T y p e = " D a t a I t e m "   E l e m e n t I d = " 1 1 1 1 4 6 3 1 7 2 " > + 
+                         < A m t _ D t l d C u s t L e d g E n t r i e s   E l e m e n t T y p e = " C o l u m n "   E l e m e n t I d = " 8 9 7 9 8 5 1 7 9 "   D a t a T y p e = " D e c i m a l " > A m t _ D t l d C u s t L e d g E n t r i e s < / A m t _ D t l d C u s t L e d g E n t r i e s > + 
+                         < C u r r C o d e _ D t l d C u s t L e d g E n t r i e s   E l e m e n t T y p e = " C o l u m n "   E l e m e n t I d = " 3 2 7 0 9 9 9 8 4 "   D a t a T y p e = " C o d e " > C u r r C o d e _ D t l d C u s t L e d g E n t r i e s < / C u r r C o d e _ D t l d C u s t L e d g E n t r i e s > + 
+                         < C u r r e n c y 2 C o d e   E l e m e n t T y p e = " C o l u m n "   E l e m e n t I d = " 4 6 5 9 9 3 8 2 7 "   D a t a T y p e = " C o d e " > C u r r e n c y 2 C o d e < / C u r r e n c y 2 C o d e > + 
+                         < C u s t B a l a n c e   E l e m e n t T y p e = " C o l u m n "   E l e m e n t I d = " 1 4 1 3 7 0 1 5 0 2 "   D a t a T y p e = " D e c i m a l " > C u s t B a l a n c e < / C u s t B a l a n c e > + 
+                         < D e s c r i p t i o n   E l e m e n t T y p e = " C o l u m n "   E l e m e n t I d = " 1 3 1 4 3 5 1 3 0 7 "   D a t a T y p e = " T e x t " > D e s c r i p t i o n < / D e s c r i p t i o n > + 
+                         < D o c N o _ D t l d C u s t L e d g E n t r i e s   E l e m e n t T y p e = " C o l u m n "   E l e m e n t I d = " 2 2 4 2 9 8 6 5 4 "   D a t a T y p e = " C o d e " > D o c N o _ D t l d C u s t L e d g E n t r i e s < / D o c N o _ D t l d C u s t L e d g E n t r i e s > + 
+                         < D u e D a t e _ D t l d C u s t L e d g E n t r i e s   E l e m e n t T y p e = " C o l u m n "   E l e m e n t I d = " 1 4 1 7 8 6 1 6 0 3 "   D a t a T y p e = " S t r i n g " > D u e D a t e _ D t l d C u s t L e d g E n t r i e s < / D u e D a t e _ D t l d C u s t L e d g E n t r i e s > + 
+                         < P o s t D a t e _ D t l d C u s t L e d g E n t r i e s   E l e m e n t T y p e = " C o l u m n "   E l e m e n t I d = " 1 6 8 8 2 9 9 9 1 3 "   D a t a T y p e = " S t r i n g " > P o s t D a t e _ D t l d C u s t L e d g E n t r i e s < / P o s t D a t e _ D t l d C u s t L e d g E n t r i e s > + 
+                         < R e m a i n A m t _ D t l d C u s t L e d g E n t r i e s   E l e m e n t T y p e = " C o l u m n "   E l e m e n t I d = " 1 4 5 7 2 4 8 8 2 5 "   D a t a T y p e = " D e c i m a l " > R e m a i n A m t _ D t l d C u s t L e d g E n t r i e s < / R e m a i n A m t _ D t l d C u s t L e d g E n t r i e s > + 
+                         < Y o u r R e f e r e n c e _ D t l d C u s t L e d g E n t r i e s   E l e m e n t T y p e = " C o l u m n "   E l e m e n t I d = " 6 7 5 1 3 6 1 6 7 "   D a t a T y p e = " T e x t " > Y o u r R e f e r e n c e _ D t l d C u s t L e d g E n t r i e s < / Y o u r R e f e r e n c e _ D t l d C u s t L e d g E n t r i e s > + 
+                     < / D t l d C u s t L e d g E n t r i e s > + 
+                 < / C u s t L e d g E n t r y H d r > + 
+                 < C u s t L e d g E n t r y F o o t e r   E l e m e n t T y p e = " D a t a I t e m "   E l e m e n t I d = " 9 2 5 1 1 8 7 3 5 " > + 
+                     < C u r r e n c y C o d e 3 _ C u s t L e d g E n t r y F o o t e r   E l e m e n t T y p e = " C o l u m n "   E l e m e n t I d = " 1 7 6 5 6 9 2 8 1 "   D a t a T y p e = " C o d e " > C u r r e n c y C o d e 3 _ C u s t L e d g E n t r y F o o t e r < / C u r r e n c y C o d e 3 _ C u s t L e d g E n t r y F o o t e r > + 
+                     < C u s t B a l a n c e _ C u s t L e d g E n t r y H d r F o o t e r   E l e m e n t T y p e = " C o l u m n "   E l e m e n t I d = " 1 3 6 7 2 1 4 5 9 3 "   D a t a T y p e = " D e c i m a l " > C u s t B a l a n c e _ C u s t L e d g E n t r y H d r F o o t e r < / C u s t B a l a n c e _ C u s t L e d g E n t r y H d r F o o t e r > + 
+                     < E n t r i e s E x i s t s l _ C u s t L e d g E n t r y F o o t e r C a p t i o n   E l e m e n t T y p e = " C o l u m n "   E l e m e n t I d = " 1 1 7 7 0 6 9 2 3 2 "   D a t a T y p e = " B o o l e a n " > E n t r i e s E x i s t s l _ C u s t L e d g E n t r y F o o t e r C a p t i o n < / E n t r i e s E x i s t s l _ C u s t L e d g E n t r y F o o t e r C a p t i o n > + 
+                     < T o t a l _ C a p t i o n   E l e m e n t T y p e = " C o l u m n "   E l e m e n t I d = " 6 1 1 5 9 7 6 3 4 "   D a t a T y p e = " L a b e l " > T o t a l _ C a p t i o n < / T o t a l _ C a p t i o n > + 
+                 < / C u s t L e d g E n t r y F o o t e r > + 
+                 < O v e r d u e V i s i b l e   E l e m e n t T y p e = " D a t a I t e m "   E l e m e n t I d = " 1 4 2 6 6 4 4 0 8 7 " > + 
+                     < C u r r e n c y C o d e 3 _ C u s t L e d g E n t r y 2   E l e m e n t T y p e = " C o l u m n "   E l e m e n t I d = " 1 4 9 4 2 9 8 6 2 2 "   D a t a T y p e = " C o d e " > C u r r e n c y C o d e 3 _ C u s t L e d g E n t r y 2 < / C u r r e n c y C o d e 3 _ C u s t L e d g E n t r y 2 > + 
+                     < D e s c _ C u s t L e d g E n t r y 2 C a p t i o n 2   E l e m e n t T y p e = " C o l u m n "   E l e m e n t I d = " 1 9 5 4 6 4 5 1 6 2 "   D a t a T y p e = " S t r i n g " > D e s c _ C u s t L e d g E n t r y 2 C a p t i o n 2 < / D e s c _ C u s t L e d g E n t r y 2 C a p t i o n 2 > + 
+                     < D o c N o _ D t l d C u s t L e d g E n t r i e s C a p t i o n 2   E l e m e n t T y p e = " C o l u m n "   E l e m e n t I d = " 1 0 9 6 5 7 7 3 7 8 "   D a t a T y p e = " S t r i n g " > D o c N o _ D t l d C u s t L e d g E n t r i e s C a p t i o n 2 < / D o c N o _ D t l d C u s t L e d g E n t r i e s C a p t i o n 2 > + 
+                     < D u e D a t e _ C u s t L e d g E n t r y 2 C a p t i o n 2   E l e m e n t T y p e = " C o l u m n "   E l e m e n t I d = " 9 0 1 1 8 8 6 8 5 "   D a t a T y p e = " L a b e l " > D u e D a t e _ C u s t L e d g E n t r y 2 C a p t i o n 2 < / D u e D a t e _ C u s t L e d g E n t r y 2 C a p t i o n 2 > + 
+                     < O r i g i n a l A m t _ C u s t L e d g E n t r y 2 C a p t i o n 2   E l e m e n t T y p e = " C o l u m n "   E l e m e n t I d = " 1 6 4 9 8 2 3 4 6 6 "   D a t a T y p e = " S t r i n g " > O r i g i n a l A m t _ C u s t L e d g E n t r y 2 C a p t i o n 2 < / O r i g i n a l A m t _ C u s t L e d g E n t r y 2 C a p t i o n 2 > + 
+                     < O v e r D u e E n t r i e s   E l e m e n t T y p e = " C o l u m n "   E l e m e n t I d = " 2 3 9 2 5 5 2 1 3 "   D a t a T y p e = " S t r i n g " > O v e r D u e E n t r i e s < / O v e r D u e E n t r i e s > + 
+                     < P o s t D a t e _ D t l d C u s t L e d g E n t r i e s C a p t i o n 2   E l e m e n t T y p e = " C o l u m n "   E l e m e n t I d = " 7 1 5 0 7 2 1 9 7 "   D a t a T y p e = " L a b e l " > P o s t D a t e _ D t l d C u s t L e d g E n t r i e s C a p t i o n 2 < / P o s t D a t e _ D t l d C u s t L e d g E n t r i e s C a p t i o n 2 > + 
+                     < R e m a i n A m t C u s t L e d g E n t r y 2 C a p t i o n 2   E l e m e n t T y p e = " C o l u m n "   E l e m e n t I d = " 5 0 5 0 3 3 9 6 0 "   D a t a T y p e = " S t r i n g " > R e m a i n A m t C u s t L e d g E n t r y 2 C a p t i o n 2 < / R e m a i n A m t C u s t L e d g E n t r y 2 C a p t i o n 2 > + 
+                     < T o t a l _ C a p t i o n 3   E l e m e n t T y p e = " C o l u m n "   E l e m e n t I d = " 4 3 8 5 6 6 3 5 7 "   D a t a T y p e = " L a b e l " > T o t a l _ C a p t i o n 3 < / T o t a l _ C a p t i o n 3 > + 
+                     < C u s t L e d g E n t r y 2   E l e m e n t T y p e = " D a t a I t e m "   E l e m e n t I d = " 1 3 7 2 6 3 7 0 0 8 " > + 
+                         < C u r r C o d e _ C u s t L e d g E n t r y 2   E l e m e n t T y p e = " C o l u m n "   E l e m e n t I d = " 1 5 8 9 5 4 6 2 6 8 "   D a t a T y p e = " C o d e " > C u r r C o d e _ C u s t L e d g E n t r y 2 < / C u r r C o d e _ C u s t L e d g E n t r y 2 > + 
+                         < C u r r e n c y 2 C o d e _ C u s t L e d g E n t r y 2   E l e m e n t T y p e = " C o l u m n "   E l e m e n t I d = " 1 4 2 6 8 6 9 3 0 3 "   D a t a T y p e = " C o d e " > C u r r e n c y 2 C o d e _ C u s t L e d g E n t r y 2 < / C u r r e n c y 2 C o d e _ C u s t L e d g E n t r y 2 > + 
+                         < C u s t N o _ C u s t L e d g E n t r y 2   E l e m e n t T y p e = " C o l u m n "   E l e m e n t I d = " 1 3 5 3 0 8 9 7 4 5 "   D a t a T y p e = " C o d e " > C u s t N o _ C u s t L e d g E n t r y 2 < / C u s t N o _ C u s t L e d g E n t r y 2 > + 
+                         < D e s c _ C u s t L e d g E n t r y 2   E l e m e n t T y p e = " C o l u m n "   E l e m e n t I d = " 4 0 4 4 4 3 7 9 8 "   D a t a T y p e = " T e x t " > D e s c _ C u s t L e d g E n t r y 2 < / D e s c _ C u s t L e d g E n t r y 2 > + 
+                         < D o c N o _ C u s t L e d g E n t r y 2   E l e m e n t T y p e = " C o l u m n "   E l e m e n t I d = " 5 1 0 9 1 4 9 4 "   D a t a T y p e = " C o d e " > D o c N o _ C u s t L e d g E n t r y 2 < / D o c N o _ C u s t L e d g E n t r y 2 > + 
+                         < D u e D a t e _ C u s t L e d g E n t r y 2   E l e m e n t T y p e = " C o l u m n "   E l e m e n t I d = " 1 6 3 5 3 6 3 6 4 7 "   D a t a T y p e = " S t r i n g " > D u e D a t e _ C u s t L e d g E n t r y 2 < / D u e D a t e _ C u s t L e d g E n t r y 2 > + 
+                         < O r i g i n a l A m t _ C u s t L e d g E n t r y 2   E l e m e n t T y p e = " C o l u m n "   E l e m e n t I d = " 6 5 4 0 4 5 0 9 8 "   D a t a T y p e = " D e c i m a l " > O r i g i n a l A m t _ C u s t L e d g E n t r y 2 < / O r i g i n a l A m t _ C u s t L e d g E n t r y 2 > + 
+                         < P o s t D a t e _ C u s t L e d g E n t r y 2   E l e m e n t T y p e = " C o l u m n "   E l e m e n t I d = " 1 8 1 7 1 9 2 0 4 3 "   D a t a T y p e = " S t r i n g " > P o s t D a t e _ C u s t L e d g E n t r y 2 < / P o s t D a t e _ C u s t L e d g E n t r y 2 > + 
+                         < P r i n t E n t r i e s D u e   E l e m e n t T y p e = " C o l u m n "   E l e m e n t I d = " 6 9 3 7 0 0 1 2 6 "   D a t a T y p e = " B o o l e a n " > P r i n t E n t r i e s D u e < / P r i n t E n t r i e s D u e > + 
+                         < R e m a i n A m t _ C u s t L e d g E n t r y 2   E l e m e n t T y p e = " C o l u m n "   E l e m e n t I d = " 7 5 6 3 4 5 4 1 3 "   D a t a T y p e = " D e c i m a l " > R e m a i n A m t _ C u s t L e d g E n t r y 2 < / R e m a i n A m t _ C u s t L e d g E n t r y 2 > + 
+                         < Y o u r R e f e r e n c e _ C u s t L e d g E n t r y 2   E l e m e n t T y p e = " C o l u m n "   E l e m e n t I d = " 2 0 5 5 4 0 4 3 9 5 "   D a t a T y p e = " T e x t " > Y o u r R e f e r e n c e _ C u s t L e d g E n t r y 2 < / Y o u r R e f e r e n c e _ C u s t L e d g E n t r y 2 > + 
+                     < / C u s t L e d g E n t r y 2 > + 
+                     < O v e r d u e E n t r y F o o d e r   E l e m e n t T y p e = " D a t a I t e m "   E l e m e n t I d = " 1 6 5 9 2 3 5 9 3 4 " > + 
+                         < O v e r d u e B a l a n c e   E l e m e n t T y p e = " C o l u m n "   E l e m e n t I d = " 1 1 8 6 1 4 8 4 3 9 "   D a t a T y p e = " D e c i m a l " > O v e r d u e B a l a n c e < / O v e r d u e B a l a n c e > + 
+                     < / O v e r d u e E n t r y F o o d e r > + 
+                 < / O v e r d u e V i s i b l e > + 
+             < / C u r r e n c y L o o p > + 
+             < A g i n g B a n d V i s i b l e   E l e m e n t T y p e = " D a t a I t e m "   E l e m e n t I d = " 1 9 4 1 7 6 5 1 4 0 " > + 
+                 < A g i n g C u s t L e d g E n t r y   E l e m e n t T y p e = " D a t a I t e m "   E l e m e n t I d = " 7 0 4 1 6 5 1 3 2 "   / > + 
+                 < A g i n g B a n d L o o p   E l e m e n t T y p e = " D a t a I t e m "   E l e m e n t I d = " 1 5 2 9 3 9 4 0 2 2 " > + 
+                     < A g i n g B a n d B u f C o l 1 A m t   E l e m e n t T y p e = " C o l u m n "   E l e m e n t I d = " 1 9 4 8 7 4 9 4 5 4 "   D a t a T y p e = " D e c i m a l " > A g i n g B a n d B u f C o l 1 A m t < / A g i n g B a n d B u f C o l 1 A m t > + 
+                     < A g i n g B a n d B u f C o l 2 A m t   E l e m e n t T y p e = " C o l u m n "   E l e m e n t I d = " 1 9 5 6 4 3 5 6 1 5 "   D a t a T y p e = " D e c i m a l " > A g i n g B a n d B u f C o l 2 A m t < / A g i n g B a n d B u f C o l 2 A m t > + 
+                     < A g i n g B a n d B u f C o l 3 A m t   E l e m e n t T y p e = " C o l u m n "   E l e m e n t I d = " 9 7 5 6 7 9 1 5 2 "   D a t a T y p e = " D e c i m a l " > A g i n g B a n d B u f C o l 3 A m t < / A g i n g B a n d B u f C o l 3 A m t > + 
+                     < A g i n g B a n d B u f C o l 4 A m t   E l e m e n t T y p e = " C o l u m n "   E l e m e n t I d = " 1 2 3 5 5 5 5 7 0 5 "   D a t a T y p e = " D e c i m a l " > A g i n g B a n d B u f C o l 4 A m t < / A g i n g B a n d B u f C o l 4 A m t > + 
+                     < A g i n g B a n d B u f C o l 5 A m t   E l e m e n t T y p e = " C o l u m n "   E l e m e n t I d = " 4 2 4 7 8 1 3 0 2 "   D a t a T y p e = " D e c i m a l " > A g i n g B a n d B u f C o l 5 A m t < / A g i n g B a n d B u f C o l 5 A m t > + 
+                     < A g i n g B a n d C u r r e n c y C o d e   E l e m e n t T y p e = " C o l u m n "   E l e m e n t I d = " 1 3 1 1 1 3 8 9 6 8 "   D a t a T y p e = " C o d e " > A g i n g B a n d C u r r e n c y C o d e < / A g i n g B a n d C u r r e n c y C o d e > + 
+                     < A g i n g B a n d E n d i n g D a t e   E l e m e n t T y p e = " C o l u m n "   E l e m e n t I d = " 1 3 9 0 8 7 6 8 7 "   D a t a T y p e = " S t r i n g " > A g i n g B a n d E n d i n g D a t e < / A g i n g B a n d E n d i n g D a t e > + 
+                     < A g i n g D a t e 1   E l e m e n t T y p e = " C o l u m n "   E l e m e n t I d = " 4 7 9 6 0 6 2 6 6 "   D a t a T y p e = " S t r i n g " > A g i n g D a t e 1 < / A g i n g D a t e 1 > + 
+                     < A g i n g D a t e 2   E l e m e n t T y p e = " C o l u m n "   E l e m e n t I d = " 1 1 1 7 3 0 2 8 8 3 "   D a t a T y p e = " S t r i n g " > A g i n g D a t e 2 < / A g i n g D a t e 2 > + 
+                     < A g i n g D a t e 2 1   E l e m e n t T y p e = " C o l u m n "   E l e m e n t I d = " 3 1 3 5 0 1 0 6 8 "   D a t a T y p e = " S t r i n g " > A g i n g D a t e 2 1 < / A g i n g D a t e 2 1 > + 
+                     < A g i n g D a t e 3   E l e m e n t T y p e = " C o l u m n "   E l e m e n t I d = " 1 7 5 4 9 9 9 5 0 0 "   D a t a T y p e = " S t r i n g " > A g i n g D a t e 3 < / A g i n g D a t e 3 > + 
+                     < A g i n g D a t e 3 1   E l e m e n t T y p e = " C o l u m n "   E l e m e n t I d = " 1 9 1 4 0 6 0 5 3 1 "   D a t a T y p e = " S t r i n g " > A g i n g D a t e 3 1 < / A g i n g D a t e 3 1 > + 
+                     < A g i n g D a t e 4   E l e m e n t T y p e = " C o l u m n "   E l e m e n t I d = " 1 9 0 2 2 7 1 1 7 9 "   D a t a T y p e = " S t r i n g " > A g i n g D a t e 4 < / A g i n g D a t e 4 > + 
+                     < A g i n g D a t e 4 1   E l e m e n t T y p e = " C o l u m n "   E l e m e n t I d = " 8 4 9 7 6 9 6 1 0 "   D a t a T y p e = " S t r i n g " > A g i n g D a t e 4 1 < / A g i n g D a t e 4 1 > + 
+                     < A g i n g D a t e 5   E l e m e n t T y p e = " C o l u m n "   E l e m e n t I d = " 1 2 6 4 5 7 4 5 6 2 "   D a t a T y p e = " S t r i n g " > A g i n g D a t e 5 < / A g i n g D a t e 5 > + 
+                     < A g i n g D a t e H e a d e r 1   E l e m e n t T y p e = " C o l u m n "   E l e m e n t I d = " 2 8 6 3 5 0 7 5 9 "   D a t a T y p e = " T e x t " > A g i n g D a t e H e a d e r 1 < / A g i n g D a t e H e a d e r 1 > + 
+                     < A g i n g D a t e H e a d e r 2   E l e m e n t T y p e = " C o l u m n "   E l e m e n t I d = " 3 5 1 3 4 5 8 5 8 "   D a t a T y p e = " T e x t " > A g i n g D a t e H e a d e r 2 < / A g i n g D a t e H e a d e r 2 > + 
+                     < A g i n g D a t e H e a d e r 3   E l e m e n t T y p e = " C o l u m n "   E l e m e n t I d = " 9 8 9 0 4 2 4 7 5 "   D a t a T y p e = " T e x t " > A g i n g D a t e H e a d e r 3 < / A g i n g D a t e H e a d e r 3 > + 
+                     < A g i n g D a t e H e a d e r 4   E l e m e n t T y p e = " C o l u m n "   E l e m e n t I d = " 1 6 2 6 7 3 9 0 9 2 "   D a t a T y p e = " T e x t " > A g i n g D a t e H e a d e r 4 < / A g i n g D a t e H e a d e r 4 > + 
+                     < b e f o r e C a p t i o n   E l e m e n t T y p e = " C o l u m n "   E l e m e n t I d = " 1 0 1 3 0 1 9 7 1 8 "   D a t a T y p e = " L a b e l " > b e f o r e C a p t i o n < / b e f o r e C a p t i o n > + 
+                 < / A g i n g B a n d L o o p > + 
+             < / A g i n g B a n d V i s i b l e > + 
+         < / I n t e g e r > + 
+         < L e t t e r T e x t   E l e m e n t T y p e = " D a t a I t e m "   E l e m e n t I d = " 1 5 1 0 3 5 3 8 3 4 " > + 
+             < B o d y T e x t   E l e m e n t T y p e = " C o l u m n "   E l e m e n t I d = " 1 4 9 7 5 9 8 0 8 "   D a t a T y p e = " T e x t " > B o d y T e x t < / B o d y T e x t > + 
+             < C l o s i n g T e x t   E l e m e n t T y p e = " C o l u m n "   E l e m e n t I d = " 5 1 2 1 3 5 9 0 9 "   D a t a T y p e = " L a b e l " > C l o s i n g T e x t < / C l o s i n g T e x t > + 
+             < G r e e t i n g T e x t   E l e m e n t T y p e = " C o l u m n "   E l e m e n t I d = " 1 1 7 5 2 7 9 2 8 9 "   D a t a T y p e = " L a b e l " > G r e e t i n g T e x t < / G r e e t i n g T e x t > + 
+         < / L e t t e r T e x t > + 
+     < / C u s t o m e r > + 
+ < / N a v W o r d R e p o r t X m l P a r t > 
 </file>
 
 <file path=customXml/itemProps2.xml><?xml version="1.0" encoding="utf-8"?>

</xml_diff>